<commit_message>
full update complete flow gemini3.1pro
</commit_message>
<xml_diff>
--- a/transcribed/v9/Patient004_1_digitized_v9.docx
+++ b/transcribed/v9/Patient004_1_digitized_v9.docx
@@ -290,7 +290,7 @@
                 <w:sz w:val="18"/>
                 <w:szCs w:val="18"/>
               </w:rPr>
-              <w:t xml:space="preserve">10/06/1998 (26 ετών)</w:t>
+              <w:t xml:space="preserve">10/06/1998 (24 ετών)</w:t>
             </w:r>
           </w:p>
           <w:p>
@@ -322,7 +322,7 @@
                 <w:sz w:val="18"/>
                 <w:szCs w:val="18"/>
               </w:rPr>
-              <w:t xml:space="preserve">Λ. Νίκης 55, Θεσσαλονίκη 54631</w:t>
+              <w:t xml:space="preserve">Λ. Νίκης 55, Θεσσαλονίκη 54623</w:t>
             </w:r>
           </w:p>
           <w:p>
@@ -452,7 +452,7 @@
                 <w:sz w:val="18"/>
                 <w:szCs w:val="18"/>
               </w:rPr>
-              <w:t xml:space="preserve">Από 16 ετών (2-3 τσιγάρα/ημέρα)</w:t>
+              <w:t xml:space="preserve">Από 16 ετών (2-3/ημ.)</w:t>
             </w:r>
           </w:p>
           <w:p>
@@ -516,7 +516,7 @@
                 <w:sz w:val="18"/>
                 <w:szCs w:val="18"/>
               </w:rPr>
-              <w:t xml:space="preserve">Ελεύθερο (Φ)</w:t>
+              <w:t xml:space="preserve">Ø</w:t>
             </w:r>
           </w:p>
         </w:tc>
@@ -668,19 +668,13 @@
               </w:rPr>
               <w:t xml:space="preserve">ΔΙΑΤΑΡΑΧΉ ΎΠΝΟΥ</w:t>
             </w:r>
-          </w:p>
-          <w:p>
-            <w:pPr>
-              <w:spacing w:after="40"/>
-            </w:pPr>
-            <w:r>
-              <w:rPr>
-                <w:rFonts w:ascii="Courier New" w:cs="Courier New" w:eastAsia="Courier New" w:hAnsi="Courier New"/>
-                <w:color w:val="999999"/>
-                <w:sz w:val="14"/>
-                <w:szCs w:val="14"/>
-              </w:rPr>
-              <w:t xml:space="preserve">11 </w:t>
+            <w:r>
+              <w:rPr>
+                <w:rFonts w:ascii="Arial" w:cs="Arial" w:eastAsia="Arial" w:hAnsi="Arial"/>
+                <w:sz w:val="18"/>
+                <w:szCs w:val="18"/>
+              </w:rPr>
+              <w:t xml:space="preserve"> — </w:t>
             </w:r>
             <w:r>
               <w:rPr>
@@ -763,7 +757,7 @@
                 <w:sz w:val="14"/>
                 <w:szCs w:val="14"/>
               </w:rPr>
-              <w:t xml:space="preserve">12 </w:t>
+              <w:t xml:space="preserve">11 </w:t>
             </w:r>
             <w:r>
               <w:rPr>
@@ -829,7 +823,7 @@
                 <w:sz w:val="14"/>
                 <w:szCs w:val="14"/>
               </w:rPr>
-              <w:t xml:space="preserve">13 </w:t>
+              <w:t xml:space="preserve">12 </w:t>
             </w:r>
             <w:r>
               <w:rPr>
@@ -837,7 +831,7 @@
                 <w:sz w:val="18"/>
                 <w:szCs w:val="18"/>
               </w:rPr>
-              <w:t xml:space="preserve">① </w:t>
+              <w:t xml:space="preserve">① Λήψη μυελού οστών για αδελφή (</w:t>
             </w:r>
             <w:r>
               <w:rPr>
@@ -848,7 +842,7 @@
                 <w:sz w:val="18"/>
                 <w:szCs w:val="18"/>
               </w:rPr>
-              <w:t xml:space="preserve">ΛΉΨΗ ΜΥΕΛΟΎ ΟΣΤΏΝ</w:t>
+              <w:t xml:space="preserve">ΟΛΛ</w:t>
             </w:r>
             <w:r>
               <w:rPr>
@@ -856,26 +850,7 @@
                 <w:sz w:val="18"/>
                 <w:szCs w:val="18"/>
               </w:rPr>
-              <w:t xml:space="preserve"> για την αδελφή του (ιστορικό </w:t>
-            </w:r>
-            <w:r>
-              <w:rPr>
-                <w:rFonts w:ascii="Arial" w:cs="Arial" w:eastAsia="Arial" w:hAnsi="Arial"/>
-                <w:b/>
-                <w:bCs/>
-                <w:color w:val="7B2D8E"/>
-                <w:sz w:val="18"/>
-                <w:szCs w:val="18"/>
-              </w:rPr>
-              <w:t xml:space="preserve">ΟΛΛ</w:t>
-            </w:r>
-            <w:r>
-              <w:rPr>
-                <w:rFonts w:ascii="Arial" w:cs="Arial" w:eastAsia="Arial" w:hAnsi="Arial"/>
-                <w:sz w:val="18"/>
-                <w:szCs w:val="18"/>
-              </w:rPr>
-              <w:t xml:space="preserve"> — 2012)</w:t>
+              <w:t xml:space="preserve"> — 2018)</w:t>
             </w:r>
           </w:p>
         </w:tc>
@@ -935,7 +910,7 @@
                 <w:sz w:val="18"/>
                 <w:szCs w:val="18"/>
               </w:rPr>
-              <w:t xml:space="preserve">ΟΙΚΟΓ. ΙΣΤΟΡ. — Πατέρας</w:t>
+              <w:t xml:space="preserve">ΟΙΚΟΓ. ΙΣΤΟΡ. — Πατέρας (64 ετ.)</w:t>
             </w:r>
           </w:p>
           <w:p>
@@ -949,29 +924,7 @@
                 <w:sz w:val="14"/>
                 <w:szCs w:val="14"/>
               </w:rPr>
-              <w:t xml:space="preserve">14 </w:t>
-            </w:r>
-            <w:r>
-              <w:rPr>
-                <w:rFonts w:ascii="Arial" w:cs="Arial" w:eastAsia="Arial" w:hAnsi="Arial"/>
-                <w:sz w:val="18"/>
-                <w:szCs w:val="18"/>
-              </w:rPr>
-              <w:t xml:space="preserve">64 ετών</w:t>
-            </w:r>
-          </w:p>
-          <w:p>
-            <w:pPr>
-              <w:spacing w:after="40"/>
-            </w:pPr>
-            <w:r>
-              <w:rPr>
-                <w:rFonts w:ascii="Courier New" w:cs="Courier New" w:eastAsia="Courier New" w:hAnsi="Courier New"/>
-                <w:color w:val="999999"/>
-                <w:sz w:val="14"/>
-                <w:szCs w:val="14"/>
-              </w:rPr>
-              <w:t xml:space="preserve">15 </w:t>
+              <w:t xml:space="preserve">13 </w:t>
             </w:r>
             <w:r>
               <w:rPr>
@@ -1004,7 +957,7 @@
                 <w:sz w:val="14"/>
                 <w:szCs w:val="14"/>
               </w:rPr>
-              <w:t xml:space="preserve">16 </w:t>
+              <w:t xml:space="preserve">14 </w:t>
             </w:r>
             <w:r>
               <w:rPr>
@@ -1023,7 +976,7 @@
                 <w:sz w:val="18"/>
                 <w:szCs w:val="18"/>
               </w:rPr>
-              <w:t xml:space="preserve">ΧΡΌΝΙΑ ΠΡΟΣΤΑΤΊΤΙΔΑ</w:t>
+              <w:t xml:space="preserve">ΧΡ. ΠΡΟΣΤΑΤΊΤΙΔΑ</w:t>
             </w:r>
           </w:p>
           <w:p>
@@ -1037,7 +990,7 @@
                 <w:sz w:val="14"/>
                 <w:szCs w:val="14"/>
               </w:rPr>
-              <w:t xml:space="preserve">17 </w:t>
+              <w:t xml:space="preserve">15 </w:t>
             </w:r>
             <w:r>
               <w:rPr>
@@ -1090,7 +1043,7 @@
                 <w:sz w:val="18"/>
                 <w:szCs w:val="18"/>
               </w:rPr>
-              <w:t xml:space="preserve">ΟΙΚΟΓ. ΙΣΤΟΡ. — Μητέρα</w:t>
+              <w:t xml:space="preserve">ΟΙΚΟΓ. ΙΣΤΟΡ. — Μητέρα (56 ετ.)</w:t>
             </w:r>
           </w:p>
           <w:p>
@@ -1104,29 +1057,7 @@
                 <w:sz w:val="14"/>
                 <w:szCs w:val="14"/>
               </w:rPr>
-              <w:t xml:space="preserve">18 </w:t>
-            </w:r>
-            <w:r>
-              <w:rPr>
-                <w:rFonts w:ascii="Arial" w:cs="Arial" w:eastAsia="Arial" w:hAnsi="Arial"/>
-                <w:sz w:val="18"/>
-                <w:szCs w:val="18"/>
-              </w:rPr>
-              <w:t xml:space="preserve">56 ετών</w:t>
-            </w:r>
-          </w:p>
-          <w:p>
-            <w:pPr>
-              <w:spacing w:after="40"/>
-            </w:pPr>
-            <w:r>
-              <w:rPr>
-                <w:rFonts w:ascii="Courier New" w:cs="Courier New" w:eastAsia="Courier New" w:hAnsi="Courier New"/>
-                <w:color w:val="999999"/>
-                <w:sz w:val="14"/>
-                <w:szCs w:val="14"/>
-              </w:rPr>
-              <w:t xml:space="preserve">19 </w:t>
+              <w:t xml:space="preserve">16 </w:t>
             </w:r>
             <w:r>
               <w:rPr>
@@ -1153,7 +1084,7 @@
                 <w:sz w:val="18"/>
                 <w:szCs w:val="18"/>
               </w:rPr>
-              <w:t xml:space="preserve"> στα 50 έτη</w:t>
+              <w:t xml:space="preserve"> 50 ετών</w:t>
             </w:r>
           </w:p>
           <w:p>
@@ -1167,7 +1098,7 @@
                 <w:sz w:val="14"/>
                 <w:szCs w:val="14"/>
               </w:rPr>
-              <w:t xml:space="preserve">20 </w:t>
+              <w:t xml:space="preserve">17 </w:t>
             </w:r>
             <w:r>
               <w:rPr>
@@ -1200,7 +1131,7 @@
                 <w:sz w:val="14"/>
                 <w:szCs w:val="14"/>
               </w:rPr>
-              <w:t xml:space="preserve">21 </w:t>
+              <w:t xml:space="preserve">18 </w:t>
             </w:r>
             <w:r>
               <w:rPr>
@@ -1233,7 +1164,7 @@
                 <w:sz w:val="14"/>
                 <w:szCs w:val="14"/>
               </w:rPr>
-              <w:t xml:space="preserve">22 </w:t>
+              <w:t xml:space="preserve">19 </w:t>
             </w:r>
             <w:r>
               <w:rPr>
@@ -1260,7 +1191,7 @@
                 <w:sz w:val="18"/>
                 <w:szCs w:val="18"/>
               </w:rPr>
-              <w:t xml:space="preserve"> (Χ/Γ 2018)</w:t>
+              <w:t xml:space="preserve"> αρ. (2018 — Χ/Γ)</w:t>
             </w:r>
           </w:p>
         </w:tc>
@@ -1308,7 +1239,7 @@
                 <w:sz w:val="14"/>
                 <w:szCs w:val="14"/>
               </w:rPr>
-              <w:t xml:space="preserve">23 </w:t>
+              <w:t xml:space="preserve">20 </w:t>
             </w:r>
             <w:r>
               <w:rPr>
@@ -1316,7 +1247,7 @@
                 <w:sz w:val="18"/>
                 <w:szCs w:val="18"/>
               </w:rPr>
-              <w:t xml:space="preserve">• Ιστορικό </w:t>
+              <w:t xml:space="preserve">• </w:t>
             </w:r>
             <w:r>
               <w:rPr>
@@ -1354,7 +1285,7 @@
                 <w:sz w:val="18"/>
                 <w:szCs w:val="18"/>
               </w:rPr>
-              <w:t xml:space="preserve">) (+)</w:t>
+              <w:t xml:space="preserve">)</w:t>
             </w:r>
           </w:p>
         </w:tc>
@@ -1402,7 +1333,7 @@
                 <w:sz w:val="14"/>
                 <w:szCs w:val="14"/>
               </w:rPr>
-              <w:t xml:space="preserve">24 </w:t>
+              <w:t xml:space="preserve">21 </w:t>
             </w:r>
             <w:r>
               <w:rPr>
@@ -1512,7 +1443,7 @@
                       <w:sz w:val="14"/>
                       <w:szCs w:val="14"/>
                     </w:rPr>
-                    <w:t xml:space="preserve">25</w:t>
+                    <w:t xml:space="preserve">22</w:t>
                   </w:r>
                 </w:p>
               </w:tc>
@@ -1599,7 +1530,7 @@
                       <w:sz w:val="14"/>
                       <w:szCs w:val="14"/>
                     </w:rPr>
-                    <w:t xml:space="preserve">26</w:t>
+                    <w:t xml:space="preserve">23</w:t>
                   </w:r>
                 </w:p>
               </w:tc>
@@ -1686,7 +1617,7 @@
                       <w:sz w:val="14"/>
                       <w:szCs w:val="14"/>
                     </w:rPr>
-                    <w:t xml:space="preserve">27</w:t>
+                    <w:t xml:space="preserve">24</w:t>
                   </w:r>
                 </w:p>
               </w:tc>
@@ -1773,7 +1704,7 @@
                       <w:sz w:val="14"/>
                       <w:szCs w:val="14"/>
                     </w:rPr>
-                    <w:t xml:space="preserve">28</w:t>
+                    <w:t xml:space="preserve">25</w:t>
                   </w:r>
                 </w:p>
               </w:tc>
@@ -1860,7 +1791,7 @@
                       <w:sz w:val="14"/>
                       <w:szCs w:val="14"/>
                     </w:rPr>
-                    <w:t xml:space="preserve">29</w:t>
+                    <w:t xml:space="preserve">26</w:t>
                   </w:r>
                 </w:p>
               </w:tc>
@@ -1917,7 +1848,7 @@
                       <w:sz w:val="16"/>
                       <w:szCs w:val="16"/>
                     </w:rPr>
-                    <w:t xml:space="preserve">s1, s2, SR (Φλεβοκομβικός ρυθμός), φυσιολογικοί ήχοι</w:t>
+                    <w:t xml:space="preserve">S1, S2, SR, χωρίς φυσήματα</w:t>
                   </w:r>
                 </w:p>
               </w:tc>
@@ -1947,7 +1878,7 @@
                       <w:sz w:val="14"/>
                       <w:szCs w:val="14"/>
                     </w:rPr>
-                    <w:t xml:space="preserve">30</w:t>
+                    <w:t xml:space="preserve">27</w:t>
                   </w:r>
                 </w:p>
               </w:tc>
@@ -2004,7 +1935,7 @@
                       <w:sz w:val="16"/>
                       <w:szCs w:val="16"/>
                     </w:rPr>
-                    <w:t xml:space="preserve">Αμφότεροι ελεύθεροι (ΑΨ κφ)</w:t>
+                    <w:t xml:space="preserve">ΑΨ κφ</w:t>
                   </w:r>
                 </w:p>
               </w:tc>
@@ -2034,7 +1965,7 @@
                       <w:sz w:val="14"/>
                       <w:szCs w:val="14"/>
                     </w:rPr>
-                    <w:t xml:space="preserve">31</w:t>
+                    <w:t xml:space="preserve">28</w:t>
                   </w:r>
                 </w:p>
               </w:tc>
@@ -2091,7 +2022,7 @@
                       <w:sz w:val="16"/>
                       <w:szCs w:val="16"/>
                     </w:rPr>
-                    <w:t xml:space="preserve">Μαλακή, ευπίεστη (κφ)</w:t>
+                    <w:t xml:space="preserve">κφ</w:t>
                   </w:r>
                 </w:p>
               </w:tc>
@@ -2121,7 +2052,7 @@
                       <w:sz w:val="14"/>
                       <w:szCs w:val="14"/>
                     </w:rPr>
-                    <w:t xml:space="preserve">32</w:t>
+                    <w:t xml:space="preserve">29</w:t>
                   </w:r>
                 </w:p>
               </w:tc>
@@ -2151,7 +2082,7 @@
                       <w:sz w:val="16"/>
                       <w:szCs w:val="16"/>
                     </w:rPr>
-                    <w:t xml:space="preserve">Τεν. αντανακλ.</w:t>
+                    <w:t xml:space="preserve">Τενόντια</w:t>
                   </w:r>
                 </w:p>
               </w:tc>
@@ -2208,7 +2139,7 @@
                       <w:sz w:val="14"/>
                       <w:szCs w:val="14"/>
                     </w:rPr>
-                    <w:t xml:space="preserve">33</w:t>
+                    <w:t xml:space="preserve">30</w:t>
                   </w:r>
                 </w:p>
               </w:tc>
@@ -2265,7 +2196,7 @@
                       <w:sz w:val="16"/>
                       <w:szCs w:val="16"/>
                     </w:rPr>
-                    <w:t xml:space="preserve">Χωρίς ευρήματα</w:t>
+                    <w:t xml:space="preserve">κφ</w:t>
                   </w:r>
                 </w:p>
               </w:tc>
@@ -2295,7 +2226,7 @@
                       <w:sz w:val="14"/>
                       <w:szCs w:val="14"/>
                     </w:rPr>
-                    <w:t xml:space="preserve">34</w:t>
+                    <w:t xml:space="preserve">31</w:t>
                   </w:r>
                 </w:p>
               </w:tc>
@@ -2325,7 +2256,7 @@
                       <w:sz w:val="16"/>
                       <w:szCs w:val="16"/>
                     </w:rPr>
-                    <w:t xml:space="preserve">Νευρολ. έλεγχος</w:t>
+                    <w:t xml:space="preserve">Νευρολογικό</w:t>
                   </w:r>
                 </w:p>
               </w:tc>
@@ -2382,7 +2313,7 @@
                       <w:sz w:val="14"/>
                       <w:szCs w:val="14"/>
                     </w:rPr>
-                    <w:t xml:space="preserve">35</w:t>
+                    <w:t xml:space="preserve">32</w:t>
                   </w:r>
                 </w:p>
               </w:tc>
@@ -2436,10 +2367,11 @@
                   <w:r>
                     <w:rPr>
                       <w:rFonts w:ascii="Arial" w:cs="Arial" w:eastAsia="Arial" w:hAnsi="Arial"/>
-                      <w:sz w:val="16"/>
-                      <w:szCs w:val="16"/>
-                    </w:rPr>
-                    <w:t xml:space="preserve">Όχι (Προκνημιαία — ΠΔΚ)</w:t>
+                      <w:color w:val="CC0000"/>
+                      <w:sz w:val="16"/>
+                      <w:szCs w:val="16"/>
+                    </w:rPr>
+                    <w:t xml:space="preserve">[πδΚ?]</w:t>
                   </w:r>
                 </w:p>
               </w:tc>
@@ -2469,7 +2401,7 @@
                       <w:sz w:val="14"/>
                       <w:szCs w:val="14"/>
                     </w:rPr>
-                    <w:t xml:space="preserve">36</w:t>
+                    <w:t xml:space="preserve">33</w:t>
                   </w:r>
                 </w:p>
               </w:tc>
@@ -2587,7 +2519,270 @@
                 <w:sz w:val="18"/>
                 <w:szCs w:val="18"/>
               </w:rPr>
-              <w:t xml:space="preserve">ΕΡΓΑΣΤΗΡΙΑΚΑ ΑΠΟΤΕΛΕΣΜΑΤΑ (10/04/2023 — 12/04/2023, μέσω e-mail)</w:t>
+              <w:t xml:space="preserve">ΕΡΓΑΣΤΗΡΙΑΚΑ ΑΠΟΤΕΛΕΣΜΑΤΑ</w:t>
+            </w:r>
+          </w:p>
+          <w:p>
+            <w:r>
+              <w:rPr>
+                <w:rFonts w:ascii="Arial" w:cs="Arial" w:eastAsia="Arial" w:hAnsi="Arial"/>
+                <w:i/>
+                <w:iCs/>
+                <w:sz w:val="18"/>
+                <w:szCs w:val="18"/>
+              </w:rPr>
+              <w:t xml:space="preserve">[Δεν υπάρχουν εργαστηριακά αποτελέσματα για αυτή την επίσκεψη]</w:t>
+            </w:r>
+          </w:p>
+        </w:tc>
+      </w:tr>
+    </w:tbl>
+    <w:p>
+      <w:pPr>
+        <w:spacing w:after="0" w:before="60"/>
+      </w:pPr>
+    </w:p>
+    <w:tbl>
+      <w:tblPr>
+        <w:tblW w:type="dxa" w:w="9638"/>
+        <w:tblBorders>
+          <w:top w:val="single" w:color="auto" w:sz="4"/>
+          <w:left w:val="single" w:color="auto" w:sz="4"/>
+          <w:bottom w:val="single" w:color="auto" w:sz="4"/>
+          <w:right w:val="single" w:color="auto" w:sz="4"/>
+          <w:insideH w:val="single" w:color="auto" w:sz="4"/>
+          <w:insideV w:val="single" w:color="auto" w:sz="4"/>
+        </w:tblBorders>
+      </w:tblPr>
+      <w:tblGrid>
+        <w:gridCol w:w="9638"/>
+      </w:tblGrid>
+      <w:tr>
+        <w:tc>
+          <w:tcPr>
+            <w:tcW w:type="dxa" w:w="9638"/>
+            <w:tcBorders>
+              <w:top w:val="single" w:color="999999" w:sz="1"/>
+              <w:left w:val="single" w:color="999999" w:sz="1"/>
+              <w:bottom w:val="single" w:color="999999" w:sz="1"/>
+              <w:right w:val="single" w:color="999999" w:sz="1"/>
+            </w:tcBorders>
+            <w:tcMar>
+              <w:top w:type="dxa" w:w="80"/>
+              <w:left w:type="dxa" w:w="100"/>
+              <w:bottom w:type="dxa" w:w="80"/>
+              <w:right w:type="dxa" w:w="100"/>
+            </w:tcMar>
+            <w:vAlign w:val="top"/>
+          </w:tcPr>
+          <w:p>
+            <w:pPr>
+              <w:spacing w:after="60"/>
+            </w:pPr>
+            <w:r>
+              <w:rPr>
+                <w:rFonts w:ascii="Arial" w:cs="Arial" w:eastAsia="Arial" w:hAnsi="Arial"/>
+                <w:b/>
+                <w:bCs/>
+                <w:color w:val="2E75B6"/>
+                <w:sz w:val="18"/>
+                <w:szCs w:val="18"/>
+              </w:rPr>
+              <w:t xml:space="preserve">ΟΔΗΓΙΕΣ</w:t>
+            </w:r>
+          </w:p>
+          <w:p>
+            <w:pPr>
+              <w:spacing w:after="40"/>
+            </w:pPr>
+            <w:r>
+              <w:rPr>
+                <w:rFonts w:ascii="Courier New" w:cs="Courier New" w:eastAsia="Courier New" w:hAnsi="Courier New"/>
+                <w:color w:val="999999"/>
+                <w:sz w:val="14"/>
+                <w:szCs w:val="14"/>
+              </w:rPr>
+              <w:t xml:space="preserve">34 </w:t>
+            </w:r>
+            <w:r>
+              <w:rPr>
+                <w:rFonts w:ascii="Arial" w:cs="Arial" w:eastAsia="Arial" w:hAnsi="Arial"/>
+                <w:sz w:val="18"/>
+                <w:szCs w:val="18"/>
+              </w:rPr>
+              <w:t xml:space="preserve">① Ορμονικός έλεγχος</w:t>
+            </w:r>
+          </w:p>
+          <w:p>
+            <w:pPr>
+              <w:spacing w:after="40"/>
+            </w:pPr>
+            <w:r>
+              <w:rPr>
+                <w:rFonts w:ascii="Courier New" w:cs="Courier New" w:eastAsia="Courier New" w:hAnsi="Courier New"/>
+                <w:color w:val="999999"/>
+                <w:sz w:val="14"/>
+                <w:szCs w:val="14"/>
+              </w:rPr>
+              <w:t xml:space="preserve">35 </w:t>
+            </w:r>
+            <w:r>
+              <w:rPr>
+                <w:rFonts w:ascii="Arial" w:cs="Arial" w:eastAsia="Arial" w:hAnsi="Arial"/>
+                <w:sz w:val="18"/>
+                <w:szCs w:val="18"/>
+              </w:rPr>
+              <w:t xml:space="preserve">② Μεταβολικός έλεγχος</w:t>
+            </w:r>
+          </w:p>
+        </w:tc>
+      </w:tr>
+    </w:tbl>
+    <w:p>
+      <w:pPr>
+        <w:pStyle w:val="Heading1"/>
+        <w:pageBreakBefore/>
+      </w:pPr>
+      <w:r>
+        <w:rPr>
+          <w:rFonts w:ascii="Arial" w:cs="Arial" w:eastAsia="Arial" w:hAnsi="Arial"/>
+        </w:rPr>
+        <w:t xml:space="preserve">ΕΠΙΣΚΕΨΗ 2 — 12/04/2023 (e-mail)</w:t>
+      </w:r>
+    </w:p>
+    <w:p>
+      <w:pPr>
+        <w:spacing w:after="0" w:before="60"/>
+      </w:pPr>
+    </w:p>
+    <w:tbl>
+      <w:tblPr>
+        <w:tblW w:type="dxa" w:w="9638"/>
+        <w:tblBorders>
+          <w:top w:val="single" w:color="auto" w:sz="4"/>
+          <w:left w:val="single" w:color="auto" w:sz="4"/>
+          <w:bottom w:val="single" w:color="auto" w:sz="4"/>
+          <w:right w:val="single" w:color="auto" w:sz="4"/>
+          <w:insideH w:val="single" w:color="auto" w:sz="4"/>
+          <w:insideV w:val="single" w:color="auto" w:sz="4"/>
+        </w:tblBorders>
+      </w:tblPr>
+      <w:tblGrid>
+        <w:gridCol w:w="9638"/>
+      </w:tblGrid>
+      <w:tr>
+        <w:tc>
+          <w:tcPr>
+            <w:tcW w:type="dxa" w:w="9638"/>
+            <w:tcBorders>
+              <w:top w:val="single" w:color="999999" w:sz="1"/>
+              <w:left w:val="single" w:color="999999" w:sz="1"/>
+              <w:bottom w:val="single" w:color="999999" w:sz="1"/>
+              <w:right w:val="single" w:color="999999" w:sz="1"/>
+            </w:tcBorders>
+            <w:tcMar>
+              <w:top w:type="dxa" w:w="80"/>
+              <w:left w:type="dxa" w:w="100"/>
+              <w:bottom w:type="dxa" w:w="80"/>
+              <w:right w:type="dxa" w:w="100"/>
+            </w:tcMar>
+            <w:vAlign w:val="top"/>
+          </w:tcPr>
+          <w:p>
+            <w:pPr>
+              <w:spacing w:after="60"/>
+            </w:pPr>
+            <w:r>
+              <w:rPr>
+                <w:rFonts w:ascii="Arial" w:cs="Arial" w:eastAsia="Arial" w:hAnsi="Arial"/>
+                <w:b/>
+                <w:bCs/>
+                <w:color w:val="2E75B6"/>
+                <w:sz w:val="18"/>
+                <w:szCs w:val="18"/>
+              </w:rPr>
+              <w:t xml:space="preserve">ΣΤΟΙΧΕΙΑ ΑΣΘΕΝΟΥΣ</w:t>
+            </w:r>
+          </w:p>
+          <w:p>
+            <w:pPr>
+              <w:spacing w:after="40"/>
+            </w:pPr>
+            <w:r>
+              <w:rPr>
+                <w:rFonts w:ascii="Courier New" w:cs="Courier New" w:eastAsia="Courier New" w:hAnsi="Courier New"/>
+                <w:color w:val="999999"/>
+                <w:sz w:val="14"/>
+                <w:szCs w:val="14"/>
+              </w:rPr>
+              <w:t xml:space="preserve">36 </w:t>
+            </w:r>
+            <w:r>
+              <w:rPr>
+                <w:rFonts w:ascii="Arial" w:cs="Arial" w:eastAsia="Arial" w:hAnsi="Arial"/>
+                <w:i/>
+                <w:iCs/>
+                <w:sz w:val="18"/>
+                <w:szCs w:val="18"/>
+              </w:rPr>
+              <w:t xml:space="preserve">Βλ. Επίσκεψη 1 (χωρίς αλλαγές)</w:t>
+            </w:r>
+          </w:p>
+        </w:tc>
+      </w:tr>
+    </w:tbl>
+    <w:p>
+      <w:pPr>
+        <w:spacing w:after="0" w:before="60"/>
+      </w:pPr>
+    </w:p>
+    <w:tbl>
+      <w:tblPr>
+        <w:tblW w:type="dxa" w:w="9638"/>
+        <w:tblBorders>
+          <w:top w:val="single" w:color="auto" w:sz="4"/>
+          <w:left w:val="single" w:color="auto" w:sz="4"/>
+          <w:bottom w:val="single" w:color="auto" w:sz="4"/>
+          <w:right w:val="single" w:color="auto" w:sz="4"/>
+          <w:insideH w:val="single" w:color="auto" w:sz="4"/>
+          <w:insideV w:val="single" w:color="auto" w:sz="4"/>
+        </w:tblBorders>
+      </w:tblPr>
+      <w:tblGrid>
+        <w:gridCol w:w="9638"/>
+      </w:tblGrid>
+      <w:tr>
+        <w:tc>
+          <w:tcPr>
+            <w:tcW w:type="dxa" w:w="9638"/>
+            <w:tcBorders>
+              <w:top w:val="single" w:color="999999" w:sz="1"/>
+              <w:left w:val="single" w:color="999999" w:sz="1"/>
+              <w:bottom w:val="single" w:color="999999" w:sz="1"/>
+              <w:right w:val="single" w:color="999999" w:sz="1"/>
+            </w:tcBorders>
+            <w:tcMar>
+              <w:top w:type="dxa" w:w="80"/>
+              <w:left w:type="dxa" w:w="100"/>
+              <w:bottom w:type="dxa" w:w="80"/>
+              <w:right w:type="dxa" w:w="100"/>
+            </w:tcMar>
+            <w:vAlign w:val="top"/>
+          </w:tcPr>
+          <w:p>
+            <w:pPr>
+              <w:spacing w:after="60"/>
+            </w:pPr>
+            <w:r>
+              <w:rPr>
+                <w:rFonts w:ascii="Arial" w:cs="Arial" w:eastAsia="Arial" w:hAnsi="Arial"/>
+                <w:b/>
+                <w:bCs/>
+                <w:color w:val="2E75B6"/>
+                <w:sz w:val="18"/>
+                <w:szCs w:val="18"/>
+              </w:rPr>
+              <w:t xml:space="preserve">ΕΡΓΑΣΤΗΡΙΑΚΑ ΑΠΟΤΕΛΕΣΜΑΤΑ (10/04/2023) — Άνευ αγωγής</w:t>
             </w:r>
           </w:p>
           <w:tbl>
@@ -2786,7 +2981,7 @@
                       <w:sz w:val="16"/>
                       <w:szCs w:val="16"/>
                     </w:rPr>
-                    <w:t xml:space="preserve">WBC (Λευκά)</w:t>
+                    <w:t xml:space="preserve">WBC</w:t>
                   </w:r>
                 </w:p>
               </w:tc>
@@ -2813,7 +3008,7 @@
                       <w:sz w:val="16"/>
                       <w:szCs w:val="16"/>
                     </w:rPr>
-                    <w:t xml:space="preserve">6800</w:t>
+                    <w:t xml:space="preserve">6.800</w:t>
                   </w:r>
                 </w:p>
               </w:tc>
@@ -2840,7 +3035,7 @@
                       <w:sz w:val="16"/>
                       <w:szCs w:val="16"/>
                     </w:rPr>
-                    <w:t xml:space="preserve">Τύπος: 50/39/8/3/1</w:t>
+                    <w:t xml:space="preserve"/>
                   </w:r>
                 </w:p>
               </w:tc>
@@ -2897,7 +3092,7 @@
                       <w:sz w:val="16"/>
                       <w:szCs w:val="16"/>
                     </w:rPr>
-                    <w:t xml:space="preserve">PLT (Αιμοπετάλια)</w:t>
+                    <w:t xml:space="preserve">Τύπος (Ν/Λ/Μ/Η/Β)</w:t>
                   </w:r>
                 </w:p>
               </w:tc>
@@ -2924,7 +3119,7 @@
                       <w:sz w:val="16"/>
                       <w:szCs w:val="16"/>
                     </w:rPr>
-                    <w:t xml:space="preserve">213.000</w:t>
+                    <w:t xml:space="preserve">50/39/8/3/1</w:t>
                   </w:r>
                 </w:p>
               </w:tc>
@@ -3008,7 +3203,7 @@
                       <w:sz w:val="16"/>
                       <w:szCs w:val="16"/>
                     </w:rPr>
-                    <w:t xml:space="preserve">RBC (Ερυθρά)</w:t>
+                    <w:t xml:space="preserve">PLT</w:t>
                   </w:r>
                 </w:p>
               </w:tc>
@@ -3035,7 +3230,7 @@
                       <w:sz w:val="16"/>
                       <w:szCs w:val="16"/>
                     </w:rPr>
-                    <w:t xml:space="preserve">5,3 x 10⁶</w:t>
+                    <w:t xml:space="preserve">213.000</w:t>
                   </w:r>
                 </w:p>
               </w:tc>
@@ -3119,7 +3314,7 @@
                       <w:sz w:val="16"/>
                       <w:szCs w:val="16"/>
                     </w:rPr>
-                    <w:t xml:space="preserve">HGB (Αιμοσφαιρίνη)</w:t>
+                    <w:t xml:space="preserve">RBC</w:t>
                   </w:r>
                 </w:p>
               </w:tc>
@@ -3146,7 +3341,7 @@
                       <w:sz w:val="16"/>
                       <w:szCs w:val="16"/>
                     </w:rPr>
-                    <w:t xml:space="preserve">15,4</w:t>
+                    <w:t xml:space="preserve">5,3x10⁶</w:t>
                   </w:r>
                 </w:p>
               </w:tc>
@@ -3230,7 +3425,7 @@
                       <w:sz w:val="16"/>
                       <w:szCs w:val="16"/>
                     </w:rPr>
-                    <w:t xml:space="preserve">HCT (Αιματοκρίτης)</w:t>
+                    <w:t xml:space="preserve">HGB</w:t>
                   </w:r>
                 </w:p>
               </w:tc>
@@ -3257,7 +3452,7 @@
                       <w:sz w:val="16"/>
                       <w:szCs w:val="16"/>
                     </w:rPr>
-                    <w:t xml:space="preserve">49,2</w:t>
+                    <w:t xml:space="preserve">16,4</w:t>
                   </w:r>
                 </w:p>
               </w:tc>
@@ -3341,7 +3536,7 @@
                       <w:sz w:val="16"/>
                       <w:szCs w:val="16"/>
                     </w:rPr>
-                    <w:t xml:space="preserve">MCV</w:t>
+                    <w:t xml:space="preserve">HCT</w:t>
                   </w:r>
                 </w:p>
               </w:tc>
@@ -3368,7 +3563,7 @@
                       <w:sz w:val="16"/>
                       <w:szCs w:val="16"/>
                     </w:rPr>
-                    <w:t xml:space="preserve">92,8</w:t>
+                    <w:t xml:space="preserve">49,2</w:t>
                   </w:r>
                 </w:p>
               </w:tc>
@@ -3452,7 +3647,7 @@
                       <w:sz w:val="16"/>
                       <w:szCs w:val="16"/>
                     </w:rPr>
-                    <w:t xml:space="preserve">MCH</w:t>
+                    <w:t xml:space="preserve">MCV</w:t>
                   </w:r>
                 </w:p>
               </w:tc>
@@ -3479,7 +3674,7 @@
                       <w:sz w:val="16"/>
                       <w:szCs w:val="16"/>
                     </w:rPr>
-                    <w:t xml:space="preserve">31</w:t>
+                    <w:t xml:space="preserve">92,8</w:t>
                   </w:r>
                 </w:p>
               </w:tc>
@@ -3563,7 +3758,7 @@
                       <w:sz w:val="16"/>
                       <w:szCs w:val="16"/>
                     </w:rPr>
-                    <w:t xml:space="preserve">MCHC</w:t>
+                    <w:t xml:space="preserve">MCH</w:t>
                   </w:r>
                 </w:p>
               </w:tc>
@@ -3590,7 +3785,7 @@
                       <w:sz w:val="16"/>
                       <w:szCs w:val="16"/>
                     </w:rPr>
-                    <w:t xml:space="preserve">33,4</w:t>
+                    <w:t xml:space="preserve">31</w:t>
                   </w:r>
                 </w:p>
               </w:tc>
@@ -3674,7 +3869,7 @@
                       <w:sz w:val="16"/>
                       <w:szCs w:val="16"/>
                     </w:rPr>
-                    <w:t xml:space="preserve">RDW</w:t>
+                    <w:t xml:space="preserve">MCHC</w:t>
                   </w:r>
                 </w:p>
               </w:tc>
@@ -3701,7 +3896,7 @@
                       <w:sz w:val="16"/>
                       <w:szCs w:val="16"/>
                     </w:rPr>
-                    <w:t xml:space="preserve">12,7</w:t>
+                    <w:t xml:space="preserve">33,4</w:t>
                   </w:r>
                 </w:p>
               </w:tc>
@@ -3785,7 +3980,7 @@
                       <w:sz w:val="16"/>
                       <w:szCs w:val="16"/>
                     </w:rPr>
-                    <w:t xml:space="preserve">CRP</w:t>
+                    <w:t xml:space="preserve">RDW</w:t>
                   </w:r>
                 </w:p>
               </w:tc>
@@ -3812,7 +4007,7 @@
                       <w:sz w:val="16"/>
                       <w:szCs w:val="16"/>
                     </w:rPr>
-                    <w:t xml:space="preserve">0,36</w:t>
+                    <w:t xml:space="preserve">12,7</w:t>
                   </w:r>
                 </w:p>
               </w:tc>
@@ -3839,7 +4034,7 @@
                       <w:sz w:val="16"/>
                       <w:szCs w:val="16"/>
                     </w:rPr>
-                    <w:t xml:space="preserve">ΦΤ &lt; 6</w:t>
+                    <w:t xml:space="preserve"/>
                   </w:r>
                 </w:p>
               </w:tc>
@@ -3896,7 +4091,7 @@
                       <w:sz w:val="16"/>
                       <w:szCs w:val="16"/>
                     </w:rPr>
-                    <w:t xml:space="preserve">Γλυκόζη (Glu)</w:t>
+                    <w:t xml:space="preserve">CRP</w:t>
                   </w:r>
                 </w:p>
               </w:tc>
@@ -3923,7 +4118,7 @@
                       <w:sz w:val="16"/>
                       <w:szCs w:val="16"/>
                     </w:rPr>
-                    <w:t xml:space="preserve">92</w:t>
+                    <w:t xml:space="preserve">0,36</w:t>
                   </w:r>
                 </w:p>
               </w:tc>
@@ -3950,7 +4145,7 @@
                       <w:sz w:val="16"/>
                       <w:szCs w:val="16"/>
                     </w:rPr>
-                    <w:t xml:space="preserve"/>
+                    <w:t xml:space="preserve">ΦΤ &lt; 6</w:t>
                   </w:r>
                 </w:p>
               </w:tc>
@@ -4007,7 +4202,7 @@
                       <w:sz w:val="16"/>
                       <w:szCs w:val="16"/>
                     </w:rPr>
-                    <w:t xml:space="preserve">Ουρία</w:t>
+                    <w:t xml:space="preserve">Glu</w:t>
                   </w:r>
                 </w:p>
               </w:tc>
@@ -4034,7 +4229,7 @@
                       <w:sz w:val="16"/>
                       <w:szCs w:val="16"/>
                     </w:rPr>
-                    <w:t xml:space="preserve">36</w:t>
+                    <w:t xml:space="preserve">92</w:t>
                   </w:r>
                 </w:p>
               </w:tc>
@@ -4118,7 +4313,7 @@
                       <w:sz w:val="16"/>
                       <w:szCs w:val="16"/>
                     </w:rPr>
-                    <w:t xml:space="preserve">Κρεατινίνη</w:t>
+                    <w:t xml:space="preserve">Ουρία</w:t>
                   </w:r>
                 </w:p>
               </w:tc>
@@ -4145,7 +4340,7 @@
                       <w:sz w:val="16"/>
                       <w:szCs w:val="16"/>
                     </w:rPr>
-                    <w:t xml:space="preserve">1,0</w:t>
+                    <w:t xml:space="preserve">36</w:t>
                   </w:r>
                 </w:p>
               </w:tc>
@@ -4229,7 +4424,7 @@
                       <w:sz w:val="16"/>
                       <w:szCs w:val="16"/>
                     </w:rPr>
-                    <w:t xml:space="preserve">Ουρικό Οξύ</w:t>
+                    <w:t xml:space="preserve">Κρεατινίνη</w:t>
                   </w:r>
                 </w:p>
               </w:tc>
@@ -4256,7 +4451,7 @@
                       <w:sz w:val="16"/>
                       <w:szCs w:val="16"/>
                     </w:rPr>
-                    <w:t xml:space="preserve">4,2</w:t>
+                    <w:t xml:space="preserve">1,0</w:t>
                   </w:r>
                 </w:p>
               </w:tc>
@@ -4340,7 +4535,7 @@
                       <w:sz w:val="16"/>
                       <w:szCs w:val="16"/>
                     </w:rPr>
-                    <w:t xml:space="preserve">Χοληστερόλη (CHOL)</w:t>
+                    <w:t xml:space="preserve">Ουρικό Οξύ</w:t>
                   </w:r>
                 </w:p>
               </w:tc>
@@ -4367,7 +4562,7 @@
                       <w:sz w:val="16"/>
                       <w:szCs w:val="16"/>
                     </w:rPr>
-                    <w:t xml:space="preserve">206</w:t>
+                    <w:t xml:space="preserve">4,2</w:t>
                   </w:r>
                 </w:p>
               </w:tc>
@@ -4451,7 +4646,7 @@
                       <w:sz w:val="16"/>
                       <w:szCs w:val="16"/>
                     </w:rPr>
-                    <w:t xml:space="preserve">HDL</w:t>
+                    <w:t xml:space="preserve">CHOL</w:t>
                   </w:r>
                 </w:p>
               </w:tc>
@@ -4478,7 +4673,7 @@
                       <w:sz w:val="16"/>
                       <w:szCs w:val="16"/>
                     </w:rPr>
-                    <w:t xml:space="preserve">55,2</w:t>
+                    <w:t xml:space="preserve">206</w:t>
                   </w:r>
                 </w:p>
               </w:tc>
@@ -4562,7 +4757,7 @@
                       <w:sz w:val="16"/>
                       <w:szCs w:val="16"/>
                     </w:rPr>
-                    <w:t xml:space="preserve">Τριγλυκερίδια (Trig)</w:t>
+                    <w:t xml:space="preserve">HDL</w:t>
                   </w:r>
                 </w:p>
               </w:tc>
@@ -4589,7 +4784,7 @@
                       <w:sz w:val="16"/>
                       <w:szCs w:val="16"/>
                     </w:rPr>
-                    <w:t xml:space="preserve">80</w:t>
+                    <w:t xml:space="preserve">55,2</w:t>
                   </w:r>
                 </w:p>
               </w:tc>
@@ -4673,7 +4868,7 @@
                       <w:sz w:val="16"/>
                       <w:szCs w:val="16"/>
                     </w:rPr>
-                    <w:t xml:space="preserve">LDL</w:t>
+                    <w:t xml:space="preserve">Τριγλυκερίδια</w:t>
                   </w:r>
                 </w:p>
               </w:tc>
@@ -4700,7 +4895,7 @@
                       <w:sz w:val="16"/>
                       <w:szCs w:val="16"/>
                     </w:rPr>
-                    <w:t xml:space="preserve">135</w:t>
+                    <w:t xml:space="preserve">80</w:t>
                   </w:r>
                 </w:p>
               </w:tc>
@@ -4784,7 +4979,7 @@
                       <w:sz w:val="16"/>
                       <w:szCs w:val="16"/>
                     </w:rPr>
-                    <w:t xml:space="preserve">SGPT</w:t>
+                    <w:t xml:space="preserve">LDL</w:t>
                   </w:r>
                 </w:p>
               </w:tc>
@@ -4808,12 +5003,10 @@
                   <w:r>
                     <w:rPr>
                       <w:rFonts w:ascii="Arial" w:cs="Arial" w:eastAsia="Arial" w:hAnsi="Arial"/>
-                      <w:b/>
-                      <w:bCs/>
-                      <w:sz w:val="16"/>
-                      <w:szCs w:val="16"/>
-                    </w:rPr>
-                    <w:t xml:space="preserve">115 ↑</w:t>
+                      <w:sz w:val="16"/>
+                      <w:szCs w:val="16"/>
+                    </w:rPr>
+                    <w:t xml:space="preserve">135</w:t>
                   </w:r>
                 </w:p>
               </w:tc>
@@ -4897,7 +5090,7 @@
                       <w:sz w:val="16"/>
                       <w:szCs w:val="16"/>
                     </w:rPr>
-                    <w:t xml:space="preserve">γGT</w:t>
+                    <w:t xml:space="preserve">SGPT</w:t>
                   </w:r>
                 </w:p>
               </w:tc>
@@ -4924,7 +5117,7 @@
                       <w:sz w:val="16"/>
                       <w:szCs w:val="16"/>
                     </w:rPr>
-                    <w:t xml:space="preserve">15</w:t>
+                    <w:t xml:space="preserve">115</w:t>
                   </w:r>
                 </w:p>
               </w:tc>
@@ -5008,7 +5201,7 @@
                       <w:sz w:val="16"/>
                       <w:szCs w:val="16"/>
                     </w:rPr>
-                    <w:t xml:space="preserve">ALP</w:t>
+                    <w:t xml:space="preserve">γGT</w:t>
                   </w:r>
                 </w:p>
               </w:tc>
@@ -5035,7 +5228,7 @@
                       <w:sz w:val="16"/>
                       <w:szCs w:val="16"/>
                     </w:rPr>
-                    <w:t xml:space="preserve">119</w:t>
+                    <w:t xml:space="preserve">15</w:t>
                   </w:r>
                 </w:p>
               </w:tc>
@@ -5062,7 +5255,7 @@
                       <w:sz w:val="16"/>
                       <w:szCs w:val="16"/>
                     </w:rPr>
-                    <w:t xml:space="preserve">ΦΤ: 10-280</w:t>
+                    <w:t xml:space="preserve"/>
                   </w:r>
                 </w:p>
               </w:tc>
@@ -5119,7 +5312,7 @@
                       <w:sz w:val="16"/>
                       <w:szCs w:val="16"/>
                     </w:rPr>
-                    <w:t xml:space="preserve">Αλβουμίνη (Alb)</w:t>
+                    <w:t xml:space="preserve">ALP</w:t>
                   </w:r>
                 </w:p>
               </w:tc>
@@ -5146,7 +5339,7 @@
                       <w:sz w:val="16"/>
                       <w:szCs w:val="16"/>
                     </w:rPr>
-                    <w:t xml:space="preserve">4,6</w:t>
+                    <w:t xml:space="preserve">119</w:t>
                   </w:r>
                 </w:p>
               </w:tc>
@@ -5173,7 +5366,7 @@
                       <w:sz w:val="16"/>
                       <w:szCs w:val="16"/>
                     </w:rPr>
-                    <w:t xml:space="preserve"/>
+                    <w:t xml:space="preserve">ΦΤ: 40-280</w:t>
                   </w:r>
                 </w:p>
               </w:tc>
@@ -5230,7 +5423,7 @@
                       <w:sz w:val="16"/>
                       <w:szCs w:val="16"/>
                     </w:rPr>
-                    <w:t xml:space="preserve">Ασβέστιο (Ca)</w:t>
+                    <w:t xml:space="preserve">Αλβουμίνη</w:t>
                   </w:r>
                 </w:p>
               </w:tc>
@@ -5257,7 +5450,7 @@
                       <w:sz w:val="16"/>
                       <w:szCs w:val="16"/>
                     </w:rPr>
-                    <w:t xml:space="preserve">10,1 (9,62)</w:t>
+                    <w:t xml:space="preserve">4,6</w:t>
                   </w:r>
                 </w:p>
               </w:tc>
@@ -5341,7 +5534,7 @@
                       <w:sz w:val="16"/>
                       <w:szCs w:val="16"/>
                     </w:rPr>
-                    <w:t xml:space="preserve">Φώσφορος (P)</w:t>
+                    <w:t xml:space="preserve">Ca</w:t>
                   </w:r>
                 </w:p>
               </w:tc>
@@ -5368,7 +5561,7 @@
                       <w:sz w:val="16"/>
                       <w:szCs w:val="16"/>
                     </w:rPr>
-                    <w:t xml:space="preserve">4,5</w:t>
+                    <w:t xml:space="preserve">10,1 (διορθ. 9,62)</w:t>
                   </w:r>
                 </w:p>
               </w:tc>
@@ -5452,7 +5645,7 @@
                       <w:sz w:val="16"/>
                       <w:szCs w:val="16"/>
                     </w:rPr>
-                    <w:t xml:space="preserve">Μαγνήσιο (Mg)</w:t>
+                    <w:t xml:space="preserve">P</w:t>
                   </w:r>
                 </w:p>
               </w:tc>
@@ -5479,7 +5672,7 @@
                       <w:sz w:val="16"/>
                       <w:szCs w:val="16"/>
                     </w:rPr>
-                    <w:t xml:space="preserve">2,0</w:t>
+                    <w:t xml:space="preserve">4,5</w:t>
                   </w:r>
                 </w:p>
               </w:tc>
@@ -5563,7 +5756,7 @@
                       <w:sz w:val="16"/>
                       <w:szCs w:val="16"/>
                     </w:rPr>
-                    <w:t xml:space="preserve">Κάλιο (K)</w:t>
+                    <w:t xml:space="preserve">Mg</w:t>
                   </w:r>
                 </w:p>
               </w:tc>
@@ -5590,7 +5783,7 @@
                       <w:sz w:val="16"/>
                       <w:szCs w:val="16"/>
                     </w:rPr>
-                    <w:t xml:space="preserve">4,1</w:t>
+                    <w:t xml:space="preserve">2,0</w:t>
                   </w:r>
                 </w:p>
               </w:tc>
@@ -5674,7 +5867,7 @@
                       <w:sz w:val="16"/>
                       <w:szCs w:val="16"/>
                     </w:rPr>
-                    <w:t xml:space="preserve">Νάτριο (Na)</w:t>
+                    <w:t xml:space="preserve">K</w:t>
                   </w:r>
                 </w:p>
               </w:tc>
@@ -5701,7 +5894,7 @@
                       <w:sz w:val="16"/>
                       <w:szCs w:val="16"/>
                     </w:rPr>
-                    <w:t xml:space="preserve">143</w:t>
+                    <w:t xml:space="preserve">4,1</w:t>
                   </w:r>
                 </w:p>
               </w:tc>
@@ -5785,7 +5978,7 @@
                       <w:sz w:val="16"/>
                       <w:szCs w:val="16"/>
                     </w:rPr>
-                    <w:t xml:space="preserve">ANA (Αντιπυρηνικά)</w:t>
+                    <w:t xml:space="preserve">Na</w:t>
                   </w:r>
                 </w:p>
               </w:tc>
@@ -5812,7 +6005,7 @@
                       <w:sz w:val="16"/>
                       <w:szCs w:val="16"/>
                     </w:rPr>
-                    <w:t xml:space="preserve">Αρνητικά (−)</w:t>
+                    <w:t xml:space="preserve">143</w:t>
                   </w:r>
                 </w:p>
               </w:tc>
@@ -5896,7 +6089,7 @@
                       <w:sz w:val="16"/>
                       <w:szCs w:val="16"/>
                     </w:rPr>
-                    <w:t xml:space="preserve">CPK</w:t>
+                    <w:t xml:space="preserve">ANA</w:t>
                   </w:r>
                 </w:p>
               </w:tc>
@@ -5920,12 +6113,10 @@
                   <w:r>
                     <w:rPr>
                       <w:rFonts w:ascii="Arial" w:cs="Arial" w:eastAsia="Arial" w:hAnsi="Arial"/>
-                      <w:b/>
-                      <w:bCs/>
-                      <w:sz w:val="16"/>
-                      <w:szCs w:val="16"/>
-                    </w:rPr>
-                    <w:t xml:space="preserve">2598 ↑</w:t>
+                      <w:sz w:val="16"/>
+                      <w:szCs w:val="16"/>
+                    </w:rPr>
+                    <w:t xml:space="preserve">(-) αρν.</w:t>
                   </w:r>
                 </w:p>
               </w:tc>
@@ -5952,7 +6143,7 @@
                       <w:sz w:val="16"/>
                       <w:szCs w:val="16"/>
                     </w:rPr>
-                    <w:t xml:space="preserve">ΦΤ: 20-180</w:t>
+                    <w:t xml:space="preserve"/>
                   </w:r>
                 </w:p>
               </w:tc>
@@ -6009,7 +6200,7 @@
                       <w:sz w:val="16"/>
                       <w:szCs w:val="16"/>
                     </w:rPr>
-                    <w:t xml:space="preserve">Φερριτίνη</w:t>
+                    <w:t xml:space="preserve">CPK</w:t>
                   </w:r>
                 </w:p>
               </w:tc>
@@ -6036,7 +6227,7 @@
                       <w:sz w:val="16"/>
                       <w:szCs w:val="16"/>
                     </w:rPr>
-                    <w:t xml:space="preserve">303</w:t>
+                    <w:t xml:space="preserve">2.598</w:t>
                   </w:r>
                 </w:p>
               </w:tc>
@@ -6063,7 +6254,7 @@
                       <w:sz w:val="16"/>
                       <w:szCs w:val="16"/>
                     </w:rPr>
-                    <w:t xml:space="preserve">ΦΤ: 15-400</w:t>
+                    <w:t xml:space="preserve">ΦΤ: 20-180</w:t>
                   </w:r>
                 </w:p>
               </w:tc>
@@ -6120,7 +6311,7 @@
                       <w:sz w:val="16"/>
                       <w:szCs w:val="16"/>
                     </w:rPr>
-                    <w:t xml:space="preserve">Ομοκυστεΐνη</w:t>
+                    <w:t xml:space="preserve">Φερριτίνη</w:t>
                   </w:r>
                 </w:p>
               </w:tc>
@@ -6147,7 +6338,7 @@
                       <w:sz w:val="16"/>
                       <w:szCs w:val="16"/>
                     </w:rPr>
-                    <w:t xml:space="preserve">8,0</w:t>
+                    <w:t xml:space="preserve">303</w:t>
                   </w:r>
                 </w:p>
               </w:tc>
@@ -6174,7 +6365,7 @@
                       <w:sz w:val="16"/>
                       <w:szCs w:val="16"/>
                     </w:rPr>
-                    <w:t xml:space="preserve"/>
+                    <w:t xml:space="preserve">ΦΤ: 15-400</w:t>
                   </w:r>
                 </w:p>
               </w:tc>
@@ -6231,7 +6422,7 @@
                       <w:sz w:val="16"/>
                       <w:szCs w:val="16"/>
                     </w:rPr>
-                    <w:t xml:space="preserve">Βιταμίνη B12</w:t>
+                    <w:t xml:space="preserve">Ομοκυστεΐνη</w:t>
                   </w:r>
                 </w:p>
               </w:tc>
@@ -6258,7 +6449,7 @@
                       <w:sz w:val="16"/>
                       <w:szCs w:val="16"/>
                     </w:rPr>
-                    <w:t xml:space="preserve">460</w:t>
+                    <w:t xml:space="preserve">8,0</w:t>
                   </w:r>
                 </w:p>
               </w:tc>
@@ -6342,7 +6533,7 @@
                       <w:sz w:val="16"/>
                       <w:szCs w:val="16"/>
                     </w:rPr>
-                    <w:t xml:space="preserve">Φυλλικό Οξύ</w:t>
+                    <w:t xml:space="preserve">B12</w:t>
                   </w:r>
                 </w:p>
               </w:tc>
@@ -6369,7 +6560,7 @@
                       <w:sz w:val="16"/>
                       <w:szCs w:val="16"/>
                     </w:rPr>
-                    <w:t xml:space="preserve">3,0</w:t>
+                    <w:t xml:space="preserve">464,0</w:t>
                   </w:r>
                 </w:p>
               </w:tc>
@@ -6453,7 +6644,7 @@
                       <w:sz w:val="16"/>
                       <w:szCs w:val="16"/>
                     </w:rPr>
-                    <w:t xml:space="preserve">25-OH D3</w:t>
+                    <w:t xml:space="preserve">Φυλλικό Οξύ</w:t>
                   </w:r>
                 </w:p>
               </w:tc>
@@ -6480,7 +6671,7 @@
                       <w:sz w:val="16"/>
                       <w:szCs w:val="16"/>
                     </w:rPr>
-                    <w:t xml:space="preserve">24</w:t>
+                    <w:t xml:space="preserve">3,0</w:t>
                   </w:r>
                 </w:p>
               </w:tc>
@@ -6564,7 +6755,7 @@
                       <w:sz w:val="16"/>
                       <w:szCs w:val="16"/>
                     </w:rPr>
-                    <w:t xml:space="preserve">PTH (Παραθορμόνη)</w:t>
+                    <w:t xml:space="preserve">25-OH-D3</w:t>
                   </w:r>
                 </w:p>
               </w:tc>
@@ -6591,7 +6782,7 @@
                       <w:sz w:val="16"/>
                       <w:szCs w:val="16"/>
                     </w:rPr>
-                    <w:t xml:space="preserve">16</w:t>
+                    <w:t xml:space="preserve">24</w:t>
                   </w:r>
                 </w:p>
               </w:tc>
@@ -6618,7 +6809,7 @@
                       <w:sz w:val="16"/>
                       <w:szCs w:val="16"/>
                     </w:rPr>
-                    <w:t xml:space="preserve">ΦΤ: 8-75</w:t>
+                    <w:t xml:space="preserve"/>
                   </w:r>
                 </w:p>
               </w:tc>
@@ -6675,7 +6866,7 @@
                       <w:sz w:val="16"/>
                       <w:szCs w:val="16"/>
                     </w:rPr>
-                    <w:t xml:space="preserve">Τεστοστερόνη (Testo)</w:t>
+                    <w:t xml:space="preserve">PTH</w:t>
                   </w:r>
                 </w:p>
               </w:tc>
@@ -6702,7 +6893,7 @@
                       <w:sz w:val="16"/>
                       <w:szCs w:val="16"/>
                     </w:rPr>
-                    <w:t xml:space="preserve">2,0</w:t>
+                    <w:t xml:space="preserve">16</w:t>
                   </w:r>
                 </w:p>
               </w:tc>
@@ -6729,7 +6920,7 @@
                       <w:sz w:val="16"/>
                       <w:szCs w:val="16"/>
                     </w:rPr>
-                    <w:t xml:space="preserve">ΦΤ: &lt; 2,5 (?)</w:t>
+                    <w:t xml:space="preserve">ΦΤ: 8-75</w:t>
                   </w:r>
                 </w:p>
               </w:tc>
@@ -6786,7 +6977,7 @@
                       <w:sz w:val="16"/>
                       <w:szCs w:val="16"/>
                     </w:rPr>
-                    <w:t xml:space="preserve">SHBG</w:t>
+                    <w:t xml:space="preserve">Testo</w:t>
                   </w:r>
                 </w:p>
               </w:tc>
@@ -6813,7 +7004,7 @@
                       <w:sz w:val="16"/>
                       <w:szCs w:val="16"/>
                     </w:rPr>
-                    <w:t xml:space="preserve">78</w:t>
+                    <w:t xml:space="preserve">9,0</w:t>
                   </w:r>
                 </w:p>
               </w:tc>
@@ -6840,7 +7031,7 @@
                       <w:sz w:val="16"/>
                       <w:szCs w:val="16"/>
                     </w:rPr>
-                    <w:t xml:space="preserve">ΦΤ: 10-70</w:t>
+                    <w:t xml:space="preserve">ΦΤ: φυσιολ.</w:t>
                   </w:r>
                 </w:p>
               </w:tc>
@@ -6897,7 +7088,7 @@
                       <w:sz w:val="16"/>
                       <w:szCs w:val="16"/>
                     </w:rPr>
-                    <w:t xml:space="preserve">TSH</w:t>
+                    <w:t xml:space="preserve">SHBG</w:t>
                   </w:r>
                 </w:p>
               </w:tc>
@@ -6924,7 +7115,7 @@
                       <w:sz w:val="16"/>
                       <w:szCs w:val="16"/>
                     </w:rPr>
-                    <w:t xml:space="preserve">2,18</w:t>
+                    <w:t xml:space="preserve">78</w:t>
                   </w:r>
                 </w:p>
               </w:tc>
@@ -6951,7 +7142,7 @@
                       <w:sz w:val="16"/>
                       <w:szCs w:val="16"/>
                     </w:rPr>
-                    <w:t xml:space="preserve">ΦΤ: 0,2-4,5</w:t>
+                    <w:t xml:space="preserve">ΦΤ: 10-70</w:t>
                   </w:r>
                 </w:p>
               </w:tc>
@@ -7008,7 +7199,7 @@
                       <w:sz w:val="16"/>
                       <w:szCs w:val="16"/>
                     </w:rPr>
-                    <w:t xml:space="preserve">Anti-TPO</w:t>
+                    <w:t xml:space="preserve">TSH</w:t>
                   </w:r>
                 </w:p>
               </w:tc>
@@ -7035,7 +7226,7 @@
                       <w:sz w:val="16"/>
                       <w:szCs w:val="16"/>
                     </w:rPr>
-                    <w:t xml:space="preserve">20</w:t>
+                    <w:t xml:space="preserve">2,18</w:t>
                   </w:r>
                 </w:p>
               </w:tc>
@@ -7062,7 +7253,7 @@
                       <w:sz w:val="16"/>
                       <w:szCs w:val="16"/>
                     </w:rPr>
-                    <w:t xml:space="preserve">ΦΤ &lt; 150</w:t>
+                    <w:t xml:space="preserve">ΦΤ: 0,2-4,5</w:t>
                   </w:r>
                 </w:p>
               </w:tc>
@@ -7119,7 +7310,7 @@
                       <w:sz w:val="16"/>
                       <w:szCs w:val="16"/>
                     </w:rPr>
-                    <w:t xml:space="preserve">Anti-Tg</w:t>
+                    <w:t xml:space="preserve">Anti-TPO</w:t>
                   </w:r>
                 </w:p>
               </w:tc>
@@ -7146,7 +7337,7 @@
                       <w:sz w:val="16"/>
                       <w:szCs w:val="16"/>
                     </w:rPr>
-                    <w:t xml:space="preserve">1,5</w:t>
+                    <w:t xml:space="preserve">20</w:t>
                   </w:r>
                 </w:p>
               </w:tc>
@@ -7230,7 +7421,7 @@
                       <w:sz w:val="16"/>
                       <w:szCs w:val="16"/>
                     </w:rPr>
-                    <w:t xml:space="preserve">Γενική Ούρων</w:t>
+                    <w:t xml:space="preserve">Anti-Tg</w:t>
                   </w:r>
                 </w:p>
               </w:tc>
@@ -7257,7 +7448,7 @@
                       <w:sz w:val="16"/>
                       <w:szCs w:val="16"/>
                     </w:rPr>
-                    <w:t xml:space="preserve">ΕΒ: 1015, pH: 6</w:t>
+                    <w:t xml:space="preserve">15</w:t>
                   </w:r>
                 </w:p>
               </w:tc>
@@ -7284,7 +7475,451 @@
                       <w:sz w:val="16"/>
                       <w:szCs w:val="16"/>
                     </w:rPr>
-                    <w:t xml:space="preserve">Πυοσφαίρια: 1, Ερυθρά: 0-1</w:t>
+                    <w:t xml:space="preserve">ΦΤ &lt; 150</w:t>
+                  </w:r>
+                </w:p>
+              </w:tc>
+            </w:tr>
+            <w:tr>
+              <w:tc>
+                <w:tcPr>
+                  <w:tcW w:type="dxa" w:w="500"/>
+                  <w:tcBorders>
+                    <w:top w:val="single" w:color="999999" w:sz="1"/>
+                    <w:left w:val="single" w:color="999999" w:sz="1"/>
+                    <w:bottom w:val="single" w:color="999999" w:sz="1"/>
+                    <w:right w:val="single" w:color="999999" w:sz="1"/>
+                  </w:tcBorders>
+                  <w:tcMar>
+                    <w:top w:type="dxa" w:w="20"/>
+                    <w:left w:type="dxa" w:w="60"/>
+                    <w:bottom w:type="dxa" w:w="20"/>
+                    <w:right w:type="dxa" w:w="60"/>
+                  </w:tcMar>
+                </w:tcPr>
+                <w:p>
+                  <w:r>
+                    <w:rPr>
+                      <w:rFonts w:ascii="Courier New" w:cs="Courier New" w:eastAsia="Courier New" w:hAnsi="Courier New"/>
+                      <w:color w:val="999999"/>
+                      <w:sz w:val="14"/>
+                      <w:szCs w:val="14"/>
+                    </w:rPr>
+                    <w:t xml:space="preserve">78</w:t>
+                  </w:r>
+                </w:p>
+              </w:tc>
+              <w:tc>
+                <w:tcPr>
+                  <w:tcW w:type="dxa" w:w="2600"/>
+                  <w:tcBorders>
+                    <w:top w:val="single" w:color="999999" w:sz="1"/>
+                    <w:left w:val="single" w:color="999999" w:sz="1"/>
+                    <w:bottom w:val="single" w:color="999999" w:sz="1"/>
+                    <w:right w:val="single" w:color="999999" w:sz="1"/>
+                  </w:tcBorders>
+                  <w:tcMar>
+                    <w:top w:type="dxa" w:w="20"/>
+                    <w:left w:type="dxa" w:w="60"/>
+                    <w:bottom w:type="dxa" w:w="20"/>
+                    <w:right w:type="dxa" w:w="60"/>
+                  </w:tcMar>
+                </w:tcPr>
+                <w:p>
+                  <w:r>
+                    <w:rPr>
+                      <w:rFonts w:ascii="Arial" w:cs="Arial" w:eastAsia="Arial" w:hAnsi="Arial"/>
+                      <w:sz w:val="16"/>
+                      <w:szCs w:val="16"/>
+                    </w:rPr>
+                    <w:t xml:space="preserve">Γεν. Ούρων — ΕΒ</w:t>
+                  </w:r>
+                </w:p>
+              </w:tc>
+              <w:tc>
+                <w:tcPr>
+                  <w:tcW w:type="dxa" w:w="2400"/>
+                  <w:tcBorders>
+                    <w:top w:val="single" w:color="999999" w:sz="1"/>
+                    <w:left w:val="single" w:color="999999" w:sz="1"/>
+                    <w:bottom w:val="single" w:color="999999" w:sz="1"/>
+                    <w:right w:val="single" w:color="999999" w:sz="1"/>
+                  </w:tcBorders>
+                  <w:tcMar>
+                    <w:top w:type="dxa" w:w="20"/>
+                    <w:left w:type="dxa" w:w="60"/>
+                    <w:bottom w:type="dxa" w:w="20"/>
+                    <w:right w:type="dxa" w:w="60"/>
+                  </w:tcMar>
+                </w:tcPr>
+                <w:p>
+                  <w:r>
+                    <w:rPr>
+                      <w:rFonts w:ascii="Arial" w:cs="Arial" w:eastAsia="Arial" w:hAnsi="Arial"/>
+                      <w:sz w:val="16"/>
+                      <w:szCs w:val="16"/>
+                    </w:rPr>
+                    <w:t xml:space="preserve">1.015</w:t>
+                  </w:r>
+                </w:p>
+              </w:tc>
+              <w:tc>
+                <w:tcPr>
+                  <w:tcW w:type="dxa" w:w="2800"/>
+                  <w:tcBorders>
+                    <w:top w:val="single" w:color="999999" w:sz="1"/>
+                    <w:left w:val="single" w:color="999999" w:sz="1"/>
+                    <w:bottom w:val="single" w:color="999999" w:sz="1"/>
+                    <w:right w:val="single" w:color="999999" w:sz="1"/>
+                  </w:tcBorders>
+                  <w:tcMar>
+                    <w:top w:type="dxa" w:w="20"/>
+                    <w:left w:type="dxa" w:w="60"/>
+                    <w:bottom w:type="dxa" w:w="20"/>
+                    <w:right w:type="dxa" w:w="60"/>
+                  </w:tcMar>
+                </w:tcPr>
+                <w:p>
+                  <w:r>
+                    <w:rPr>
+                      <w:rFonts w:ascii="Arial" w:cs="Arial" w:eastAsia="Arial" w:hAnsi="Arial"/>
+                      <w:sz w:val="16"/>
+                      <w:szCs w:val="16"/>
+                    </w:rPr>
+                    <w:t xml:space="preserve"/>
+                  </w:r>
+                </w:p>
+              </w:tc>
+            </w:tr>
+            <w:tr>
+              <w:tc>
+                <w:tcPr>
+                  <w:tcW w:type="dxa" w:w="500"/>
+                  <w:tcBorders>
+                    <w:top w:val="single" w:color="999999" w:sz="1"/>
+                    <w:left w:val="single" w:color="999999" w:sz="1"/>
+                    <w:bottom w:val="single" w:color="999999" w:sz="1"/>
+                    <w:right w:val="single" w:color="999999" w:sz="1"/>
+                  </w:tcBorders>
+                  <w:tcMar>
+                    <w:top w:type="dxa" w:w="20"/>
+                    <w:left w:type="dxa" w:w="60"/>
+                    <w:bottom w:type="dxa" w:w="20"/>
+                    <w:right w:type="dxa" w:w="60"/>
+                  </w:tcMar>
+                </w:tcPr>
+                <w:p>
+                  <w:r>
+                    <w:rPr>
+                      <w:rFonts w:ascii="Courier New" w:cs="Courier New" w:eastAsia="Courier New" w:hAnsi="Courier New"/>
+                      <w:color w:val="999999"/>
+                      <w:sz w:val="14"/>
+                      <w:szCs w:val="14"/>
+                    </w:rPr>
+                    <w:t xml:space="preserve">79</w:t>
+                  </w:r>
+                </w:p>
+              </w:tc>
+              <w:tc>
+                <w:tcPr>
+                  <w:tcW w:type="dxa" w:w="2600"/>
+                  <w:tcBorders>
+                    <w:top w:val="single" w:color="999999" w:sz="1"/>
+                    <w:left w:val="single" w:color="999999" w:sz="1"/>
+                    <w:bottom w:val="single" w:color="999999" w:sz="1"/>
+                    <w:right w:val="single" w:color="999999" w:sz="1"/>
+                  </w:tcBorders>
+                  <w:tcMar>
+                    <w:top w:type="dxa" w:w="20"/>
+                    <w:left w:type="dxa" w:w="60"/>
+                    <w:bottom w:type="dxa" w:w="20"/>
+                    <w:right w:type="dxa" w:w="60"/>
+                  </w:tcMar>
+                </w:tcPr>
+                <w:p>
+                  <w:r>
+                    <w:rPr>
+                      <w:rFonts w:ascii="Arial" w:cs="Arial" w:eastAsia="Arial" w:hAnsi="Arial"/>
+                      <w:sz w:val="16"/>
+                      <w:szCs w:val="16"/>
+                    </w:rPr>
+                    <w:t xml:space="preserve">Γεν. Ούρων — pH</w:t>
+                  </w:r>
+                </w:p>
+              </w:tc>
+              <w:tc>
+                <w:tcPr>
+                  <w:tcW w:type="dxa" w:w="2400"/>
+                  <w:tcBorders>
+                    <w:top w:val="single" w:color="999999" w:sz="1"/>
+                    <w:left w:val="single" w:color="999999" w:sz="1"/>
+                    <w:bottom w:val="single" w:color="999999" w:sz="1"/>
+                    <w:right w:val="single" w:color="999999" w:sz="1"/>
+                  </w:tcBorders>
+                  <w:tcMar>
+                    <w:top w:type="dxa" w:w="20"/>
+                    <w:left w:type="dxa" w:w="60"/>
+                    <w:bottom w:type="dxa" w:w="20"/>
+                    <w:right w:type="dxa" w:w="60"/>
+                  </w:tcMar>
+                </w:tcPr>
+                <w:p>
+                  <w:r>
+                    <w:rPr>
+                      <w:rFonts w:ascii="Arial" w:cs="Arial" w:eastAsia="Arial" w:hAnsi="Arial"/>
+                      <w:sz w:val="16"/>
+                      <w:szCs w:val="16"/>
+                    </w:rPr>
+                    <w:t xml:space="preserve">6</w:t>
+                  </w:r>
+                </w:p>
+              </w:tc>
+              <w:tc>
+                <w:tcPr>
+                  <w:tcW w:type="dxa" w:w="2800"/>
+                  <w:tcBorders>
+                    <w:top w:val="single" w:color="999999" w:sz="1"/>
+                    <w:left w:val="single" w:color="999999" w:sz="1"/>
+                    <w:bottom w:val="single" w:color="999999" w:sz="1"/>
+                    <w:right w:val="single" w:color="999999" w:sz="1"/>
+                  </w:tcBorders>
+                  <w:tcMar>
+                    <w:top w:type="dxa" w:w="20"/>
+                    <w:left w:type="dxa" w:w="60"/>
+                    <w:bottom w:type="dxa" w:w="20"/>
+                    <w:right w:type="dxa" w:w="60"/>
+                  </w:tcMar>
+                </w:tcPr>
+                <w:p>
+                  <w:r>
+                    <w:rPr>
+                      <w:rFonts w:ascii="Arial" w:cs="Arial" w:eastAsia="Arial" w:hAnsi="Arial"/>
+                      <w:sz w:val="16"/>
+                      <w:szCs w:val="16"/>
+                    </w:rPr>
+                    <w:t xml:space="preserve"/>
+                  </w:r>
+                </w:p>
+              </w:tc>
+            </w:tr>
+            <w:tr>
+              <w:tc>
+                <w:tcPr>
+                  <w:tcW w:type="dxa" w:w="500"/>
+                  <w:tcBorders>
+                    <w:top w:val="single" w:color="999999" w:sz="1"/>
+                    <w:left w:val="single" w:color="999999" w:sz="1"/>
+                    <w:bottom w:val="single" w:color="999999" w:sz="1"/>
+                    <w:right w:val="single" w:color="999999" w:sz="1"/>
+                  </w:tcBorders>
+                  <w:tcMar>
+                    <w:top w:type="dxa" w:w="20"/>
+                    <w:left w:type="dxa" w:w="60"/>
+                    <w:bottom w:type="dxa" w:w="20"/>
+                    <w:right w:type="dxa" w:w="60"/>
+                  </w:tcMar>
+                </w:tcPr>
+                <w:p>
+                  <w:r>
+                    <w:rPr>
+                      <w:rFonts w:ascii="Courier New" w:cs="Courier New" w:eastAsia="Courier New" w:hAnsi="Courier New"/>
+                      <w:color w:val="999999"/>
+                      <w:sz w:val="14"/>
+                      <w:szCs w:val="14"/>
+                    </w:rPr>
+                    <w:t xml:space="preserve">80</w:t>
+                  </w:r>
+                </w:p>
+              </w:tc>
+              <w:tc>
+                <w:tcPr>
+                  <w:tcW w:type="dxa" w:w="2600"/>
+                  <w:tcBorders>
+                    <w:top w:val="single" w:color="999999" w:sz="1"/>
+                    <w:left w:val="single" w:color="999999" w:sz="1"/>
+                    <w:bottom w:val="single" w:color="999999" w:sz="1"/>
+                    <w:right w:val="single" w:color="999999" w:sz="1"/>
+                  </w:tcBorders>
+                  <w:tcMar>
+                    <w:top w:type="dxa" w:w="20"/>
+                    <w:left w:type="dxa" w:w="60"/>
+                    <w:bottom w:type="dxa" w:w="20"/>
+                    <w:right w:type="dxa" w:w="60"/>
+                  </w:tcMar>
+                </w:tcPr>
+                <w:p>
+                  <w:r>
+                    <w:rPr>
+                      <w:rFonts w:ascii="Arial" w:cs="Arial" w:eastAsia="Arial" w:hAnsi="Arial"/>
+                      <w:sz w:val="16"/>
+                      <w:szCs w:val="16"/>
+                    </w:rPr>
+                    <w:t xml:space="preserve">Γεν. Ούρων — Πρωτεΐνη</w:t>
+                  </w:r>
+                </w:p>
+              </w:tc>
+              <w:tc>
+                <w:tcPr>
+                  <w:tcW w:type="dxa" w:w="2400"/>
+                  <w:tcBorders>
+                    <w:top w:val="single" w:color="999999" w:sz="1"/>
+                    <w:left w:val="single" w:color="999999" w:sz="1"/>
+                    <w:bottom w:val="single" w:color="999999" w:sz="1"/>
+                    <w:right w:val="single" w:color="999999" w:sz="1"/>
+                  </w:tcBorders>
+                  <w:tcMar>
+                    <w:top w:type="dxa" w:w="20"/>
+                    <w:left w:type="dxa" w:w="60"/>
+                    <w:bottom w:type="dxa" w:w="20"/>
+                    <w:right w:type="dxa" w:w="60"/>
+                  </w:tcMar>
+                </w:tcPr>
+                <w:p>
+                  <w:r>
+                    <w:rPr>
+                      <w:rFonts w:ascii="Arial" w:cs="Arial" w:eastAsia="Arial" w:hAnsi="Arial"/>
+                      <w:sz w:val="16"/>
+                      <w:szCs w:val="16"/>
+                    </w:rPr>
+                    <w:t xml:space="preserve">0-1</w:t>
+                  </w:r>
+                </w:p>
+              </w:tc>
+              <w:tc>
+                <w:tcPr>
+                  <w:tcW w:type="dxa" w:w="2800"/>
+                  <w:tcBorders>
+                    <w:top w:val="single" w:color="999999" w:sz="1"/>
+                    <w:left w:val="single" w:color="999999" w:sz="1"/>
+                    <w:bottom w:val="single" w:color="999999" w:sz="1"/>
+                    <w:right w:val="single" w:color="999999" w:sz="1"/>
+                  </w:tcBorders>
+                  <w:tcMar>
+                    <w:top w:type="dxa" w:w="20"/>
+                    <w:left w:type="dxa" w:w="60"/>
+                    <w:bottom w:type="dxa" w:w="20"/>
+                    <w:right w:type="dxa" w:w="60"/>
+                  </w:tcMar>
+                </w:tcPr>
+                <w:p>
+                  <w:r>
+                    <w:rPr>
+                      <w:rFonts w:ascii="Arial" w:cs="Arial" w:eastAsia="Arial" w:hAnsi="Arial"/>
+                      <w:sz w:val="16"/>
+                      <w:szCs w:val="16"/>
+                    </w:rPr>
+                    <w:t xml:space="preserve"/>
+                  </w:r>
+                </w:p>
+              </w:tc>
+            </w:tr>
+            <w:tr>
+              <w:tc>
+                <w:tcPr>
+                  <w:tcW w:type="dxa" w:w="500"/>
+                  <w:tcBorders>
+                    <w:top w:val="single" w:color="999999" w:sz="1"/>
+                    <w:left w:val="single" w:color="999999" w:sz="1"/>
+                    <w:bottom w:val="single" w:color="999999" w:sz="1"/>
+                    <w:right w:val="single" w:color="999999" w:sz="1"/>
+                  </w:tcBorders>
+                  <w:tcMar>
+                    <w:top w:type="dxa" w:w="20"/>
+                    <w:left w:type="dxa" w:w="60"/>
+                    <w:bottom w:type="dxa" w:w="20"/>
+                    <w:right w:type="dxa" w:w="60"/>
+                  </w:tcMar>
+                </w:tcPr>
+                <w:p>
+                  <w:r>
+                    <w:rPr>
+                      <w:rFonts w:ascii="Courier New" w:cs="Courier New" w:eastAsia="Courier New" w:hAnsi="Courier New"/>
+                      <w:color w:val="999999"/>
+                      <w:sz w:val="14"/>
+                      <w:szCs w:val="14"/>
+                    </w:rPr>
+                    <w:t xml:space="preserve">81</w:t>
+                  </w:r>
+                </w:p>
+              </w:tc>
+              <w:tc>
+                <w:tcPr>
+                  <w:tcW w:type="dxa" w:w="2600"/>
+                  <w:tcBorders>
+                    <w:top w:val="single" w:color="999999" w:sz="1"/>
+                    <w:left w:val="single" w:color="999999" w:sz="1"/>
+                    <w:bottom w:val="single" w:color="999999" w:sz="1"/>
+                    <w:right w:val="single" w:color="999999" w:sz="1"/>
+                  </w:tcBorders>
+                  <w:tcMar>
+                    <w:top w:type="dxa" w:w="20"/>
+                    <w:left w:type="dxa" w:w="60"/>
+                    <w:bottom w:type="dxa" w:w="20"/>
+                    <w:right w:type="dxa" w:w="60"/>
+                  </w:tcMar>
+                </w:tcPr>
+                <w:p>
+                  <w:r>
+                    <w:rPr>
+                      <w:rFonts w:ascii="Arial" w:cs="Arial" w:eastAsia="Arial" w:hAnsi="Arial"/>
+                      <w:sz w:val="16"/>
+                      <w:szCs w:val="16"/>
+                    </w:rPr>
+                    <w:t xml:space="preserve">Γεν. Ούρων — Ερυθρά</w:t>
+                  </w:r>
+                </w:p>
+              </w:tc>
+              <w:tc>
+                <w:tcPr>
+                  <w:tcW w:type="dxa" w:w="2400"/>
+                  <w:tcBorders>
+                    <w:top w:val="single" w:color="999999" w:sz="1"/>
+                    <w:left w:val="single" w:color="999999" w:sz="1"/>
+                    <w:bottom w:val="single" w:color="999999" w:sz="1"/>
+                    <w:right w:val="single" w:color="999999" w:sz="1"/>
+                  </w:tcBorders>
+                  <w:tcMar>
+                    <w:top w:type="dxa" w:w="20"/>
+                    <w:left w:type="dxa" w:w="60"/>
+                    <w:bottom w:type="dxa" w:w="20"/>
+                    <w:right w:type="dxa" w:w="60"/>
+                  </w:tcMar>
+                </w:tcPr>
+                <w:p>
+                  <w:r>
+                    <w:rPr>
+                      <w:rFonts w:ascii="Arial" w:cs="Arial" w:eastAsia="Arial" w:hAnsi="Arial"/>
+                      <w:sz w:val="16"/>
+                      <w:szCs w:val="16"/>
+                    </w:rPr>
+                    <w:t xml:space="preserve">0-1</w:t>
+                  </w:r>
+                </w:p>
+              </w:tc>
+              <w:tc>
+                <w:tcPr>
+                  <w:tcW w:type="dxa" w:w="2800"/>
+                  <w:tcBorders>
+                    <w:top w:val="single" w:color="999999" w:sz="1"/>
+                    <w:left w:val="single" w:color="999999" w:sz="1"/>
+                    <w:bottom w:val="single" w:color="999999" w:sz="1"/>
+                    <w:right w:val="single" w:color="999999" w:sz="1"/>
+                  </w:tcBorders>
+                  <w:tcMar>
+                    <w:top w:type="dxa" w:w="20"/>
+                    <w:left w:type="dxa" w:w="60"/>
+                    <w:bottom w:type="dxa" w:w="20"/>
+                    <w:right w:type="dxa" w:w="60"/>
+                  </w:tcMar>
+                </w:tcPr>
+                <w:p>
+                  <w:r>
+                    <w:rPr>
+                      <w:rFonts w:ascii="Arial" w:cs="Arial" w:eastAsia="Arial" w:hAnsi="Arial"/>
+                      <w:sz w:val="16"/>
+                      <w:szCs w:val="16"/>
+                    </w:rPr>
+                    <w:t xml:space="preserve"/>
                   </w:r>
                 </w:p>
               </w:tc>
@@ -7345,7 +7980,7 @@
                 <w:sz w:val="18"/>
                 <w:szCs w:val="18"/>
               </w:rPr>
-              <w:t xml:space="preserve">ΟΔΗΓΙΕΣ</w:t>
+              <w:t xml:space="preserve">ΟΔΗΓΙΕΣ (Επίσκεψη 2)</w:t>
             </w:r>
           </w:p>
           <w:p>
@@ -7359,7 +7994,7 @@
                 <w:sz w:val="14"/>
                 <w:szCs w:val="14"/>
               </w:rPr>
-              <w:t xml:space="preserve">78 </w:t>
+              <w:t xml:space="preserve">82 </w:t>
             </w:r>
             <w:r>
               <w:rPr>
@@ -7367,17 +8002,7 @@
                 <w:sz w:val="18"/>
                 <w:szCs w:val="18"/>
               </w:rPr>
-              <w:t xml:space="preserve">① </w:t>
-            </w:r>
-            <w:r>
-              <w:rPr>
-                <w:rFonts w:ascii="Arial" w:cs="Arial" w:eastAsia="Arial" w:hAnsi="Arial"/>
-                <w:b/>
-                <w:bCs/>
-                <w:sz w:val="18"/>
-                <w:szCs w:val="18"/>
-              </w:rPr>
-              <w:t xml:space="preserve">Υπερηχογράφημα (ECHO) άνω κοιλίας</w:t>
+              <w:t xml:space="preserve">① ECHO κοιλίας</w:t>
             </w:r>
           </w:p>
           <w:p>
@@ -7391,7 +8016,7 @@
                 <w:sz w:val="14"/>
                 <w:szCs w:val="14"/>
               </w:rPr>
-              <w:t xml:space="preserve">79 </w:t>
+              <w:t xml:space="preserve">83 </w:t>
             </w:r>
             <w:r>
               <w:rPr>
@@ -7399,17 +8024,7 @@
                 <w:sz w:val="18"/>
                 <w:szCs w:val="18"/>
               </w:rPr>
-              <w:t xml:space="preserve">② Περαιτέρω έλεγχος: </w:t>
-            </w:r>
-            <w:r>
-              <w:rPr>
-                <w:rFonts w:ascii="Arial" w:cs="Arial" w:eastAsia="Arial" w:hAnsi="Arial"/>
-                <w:b/>
-                <w:bCs/>
-                <w:sz w:val="18"/>
-                <w:szCs w:val="18"/>
-              </w:rPr>
-              <w:t xml:space="preserve">ΤΚΕ</w:t>
+              <w:t xml:space="preserve">② ΤΚΕ</w:t>
             </w:r>
           </w:p>
           <w:p>
@@ -7423,7 +8038,7 @@
                 <w:sz w:val="14"/>
                 <w:szCs w:val="14"/>
               </w:rPr>
-              <w:t xml:space="preserve">80 </w:t>
+              <w:t xml:space="preserve">84 </w:t>
             </w:r>
             <w:r>
               <w:rPr>
@@ -7431,17 +8046,7 @@
                 <w:sz w:val="18"/>
                 <w:szCs w:val="18"/>
               </w:rPr>
-              <w:t xml:space="preserve">③ Επανάληψη/Έλεγχος: </w:t>
-            </w:r>
-            <w:r>
-              <w:rPr>
-                <w:rFonts w:ascii="Arial" w:cs="Arial" w:eastAsia="Arial" w:hAnsi="Arial"/>
-                <w:b/>
-                <w:bCs/>
-                <w:sz w:val="18"/>
-                <w:szCs w:val="18"/>
-              </w:rPr>
-              <w:t xml:space="preserve">SGOT, SGPT, γGT, CPK, ALP, LDH</w:t>
+              <w:t xml:space="preserve">③ SGOT, SGPT, γGT, CPK, ALP, LDH</w:t>
             </w:r>
           </w:p>
           <w:p>
@@ -7455,7 +8060,7 @@
                 <w:sz w:val="14"/>
                 <w:szCs w:val="14"/>
               </w:rPr>
-              <w:t xml:space="preserve">81 </w:t>
+              <w:t xml:space="preserve">85 </w:t>
             </w:r>
             <w:r>
               <w:rPr>
@@ -7463,17 +8068,7 @@
                 <w:sz w:val="18"/>
                 <w:szCs w:val="18"/>
               </w:rPr>
-              <w:t xml:space="preserve">④ Λιπιδαιμικός έλεγχος: </w:t>
-            </w:r>
-            <w:r>
-              <w:rPr>
-                <w:rFonts w:ascii="Arial" w:cs="Arial" w:eastAsia="Arial" w:hAnsi="Arial"/>
-                <w:b/>
-                <w:bCs/>
-                <w:sz w:val="18"/>
-                <w:szCs w:val="18"/>
-              </w:rPr>
-              <w:t xml:space="preserve">ApoA1 / ApoB, Lp(a)</w:t>
+              <w:t xml:space="preserve">④ ApoA1/ApoB, Lp(a)</w:t>
             </w:r>
           </w:p>
           <w:p>
@@ -7487,7 +8082,7 @@
                 <w:sz w:val="14"/>
                 <w:szCs w:val="14"/>
               </w:rPr>
-              <w:t xml:space="preserve">82 </w:t>
+              <w:t xml:space="preserve">86 </w:t>
             </w:r>
             <w:r>
               <w:rPr>
@@ -7495,17 +8090,7 @@
                 <w:sz w:val="18"/>
                 <w:szCs w:val="18"/>
               </w:rPr>
-              <w:t xml:space="preserve">⑤ </w:t>
-            </w:r>
-            <w:r>
-              <w:rPr>
-                <w:rFonts w:ascii="Arial" w:cs="Arial" w:eastAsia="Arial" w:hAnsi="Arial"/>
-                <w:b/>
-                <w:bCs/>
-                <w:sz w:val="18"/>
-                <w:szCs w:val="18"/>
-              </w:rPr>
-              <w:t xml:space="preserve">Έλεγχος ηπατιτίδων</w:t>
+              <w:t xml:space="preserve">⑤ Έλεγχος ηπατιτίδων</w:t>
             </w:r>
           </w:p>
           <w:p>
@@ -7519,7 +8104,7 @@
                 <w:sz w:val="14"/>
                 <w:szCs w:val="14"/>
               </w:rPr>
-              <w:t xml:space="preserve">83 </w:t>
+              <w:t xml:space="preserve">87 </w:t>
             </w:r>
             <w:r>
               <w:rPr>
@@ -7527,17 +8112,7 @@
                 <w:sz w:val="18"/>
                 <w:szCs w:val="18"/>
               </w:rPr>
-              <w:t xml:space="preserve">⑥ Ορμονικός έλεγχος: </w:t>
-            </w:r>
-            <w:r>
-              <w:rPr>
-                <w:rFonts w:ascii="Arial" w:cs="Arial" w:eastAsia="Arial" w:hAnsi="Arial"/>
-                <w:b/>
-                <w:bCs/>
-                <w:sz w:val="18"/>
-                <w:szCs w:val="18"/>
-              </w:rPr>
-              <w:t xml:space="preserve">F (Κορτιζόλη), ACTH, β-hCG, AFP</w:t>
+              <w:t xml:space="preserve">⑥ F, ACTH, β-hCG, aFP</w:t>
             </w:r>
           </w:p>
           <w:p>
@@ -7551,7 +8126,7 @@
                 <w:sz w:val="14"/>
                 <w:szCs w:val="14"/>
               </w:rPr>
-              <w:t xml:space="preserve">84 </w:t>
+              <w:t xml:space="preserve">88 </w:t>
             </w:r>
             <w:r>
               <w:rPr>
@@ -7559,17 +8134,7 @@
                 <w:sz w:val="18"/>
                 <w:szCs w:val="18"/>
               </w:rPr>
-              <w:t xml:space="preserve">⑦ </w:t>
-            </w:r>
-            <w:r>
-              <w:rPr>
-                <w:rFonts w:ascii="Arial" w:cs="Arial" w:eastAsia="Arial" w:hAnsi="Arial"/>
-                <w:b/>
-                <w:bCs/>
-                <w:sz w:val="18"/>
-                <w:szCs w:val="18"/>
-              </w:rPr>
-              <w:t xml:space="preserve">Αλδοστερόνη, Renin (Rautest)</w:t>
+              <w:t xml:space="preserve">⑦ Ανδρολόγος, RAST test</w:t>
             </w:r>
           </w:p>
         </w:tc>

</xml_diff>